<commit_message>
(chore): remove temp files
</commit_message>
<xml_diff>
--- a/blog_post_draft.docx
+++ b/blog_post_draft.docx
@@ -220,7 +220,23 @@
     </w:p>
     <w:p>
       <w:r>
-        <w:t>Before we celebrate, lets keep a few things in mind:</w:t>
+        <w:t>Before we celebrate, lets keep in mind</w:t>
+      </w:r>
+      <w:r>
+        <w:t xml:space="preserve"> that the dataset only tells us what ships were found. There could easily have been 10x or more as many smaller vessels as larger ones. We can’t tell this from the dataset. </w:t>
+      </w:r>
+    </w:p>
+    <w:p>
+      <w:r>
+        <w:t xml:space="preserve">On the flip side, larger ships can be easier to control and more stable during high winds. </w:t>
+      </w:r>
+      <w:proofErr w:type="gramStart"/>
+      <w:r>
+        <w:t>On the whole</w:t>
+      </w:r>
+      <w:proofErr w:type="gramEnd"/>
+      <w:r>
+        <w:t>, perhaps Marcus wouldn’t be steered wrong with the bigger is better motto.</w:t>
       </w:r>
     </w:p>
     <w:p/>
@@ -235,14 +251,47 @@
     </w:p>
     <w:p>
       <w:r>
-        <w:t>ss</w:t>
-      </w:r>
-    </w:p>
-    <w:p/>
+        <w:t xml:space="preserve">Alright, so we know </w:t>
+      </w:r>
+      <w:r>
+        <w:t>the Western Mediterranean Sea is a potential hotspot. We know that it’s at least plausible that bigger is better. What about the routes themselves? Are there places we want to avoid? Shipwreck magnets that strike fear into the hearts of Roman Sailors?</w:t>
+      </w:r>
+    </w:p>
+    <w:p>
+      <w:r>
+        <w:t>We have the rough latitude and longitude of the shipwrecks from the dataset. (Precise data is not provided to discourage folks from diving down and stealing from the wreckages) We can plot that on a scatter plot and see if any clusters present themselves.</w:t>
+      </w:r>
+    </w:p>
+    <w:p>
+      <w:r>
+        <w:t>&lt;&gt;</w:t>
+      </w:r>
+    </w:p>
+    <w:p>
+      <w:r>
+        <w:t>Ok, ok, it’s a bunch of bluish dots on a white background – what are we really looking at? Each dot represents a single reported shipwreck for which our dataset provides location information. They’ve been slightly transparent to make clusters of shipwrecks easier to see.</w:t>
+      </w:r>
+    </w:p>
+    <w:p>
+      <w:r>
+        <w:lastRenderedPageBreak/>
+        <w:t>Alright, so there’s quite a few shipwrecks near Italy. This is expected – that’s where most of the traffic is going to be after all. We have an even looking distribution of shipwrecks in the Eastern Mediterranean Sea, and a line of death in the South of France.</w:t>
+      </w:r>
+    </w:p>
+    <w:p>
+      <w:r>
+        <w:t>Something is going on there – maybe our young hero is best off avoiding it!</w:t>
+      </w:r>
+    </w:p>
     <w:p>
       <w:pPr>
         <w:pStyle w:val="Heading2"/>
       </w:pPr>
+    </w:p>
+    <w:p>
+      <w:pPr>
+        <w:pStyle w:val="Heading2"/>
+      </w:pPr>
       <w:r>
         <w:t xml:space="preserve">The </w:t>
       </w:r>
@@ -255,10 +304,19 @@
     </w:p>
     <w:p>
       <w:r>
-        <w:t>ss</w:t>
-      </w:r>
-    </w:p>
-    <w:p/>
+        <w:t>As he goes out into the world and begins his nautical career, Marcus would be served by looking for the biggest ship he can find. Once on it, he may want to avoid going anywhere in the Western Mediterranean Sea – especially near the South Coast of France.</w:t>
+      </w:r>
+    </w:p>
+    <w:p>
+      <w:r>
+        <w:t>This won’t guarantee his safety of course – but if safety was the only thing that mattered, Marcus would just say home and drink some wine!</w:t>
+      </w:r>
+    </w:p>
+    <w:p>
+      <w:r>
+        <w:t>Fair winds Marcus, and good luck!</w:t>
+      </w:r>
+    </w:p>
     <w:p/>
     <w:p>
       <w:pPr>
@@ -293,7 +351,19 @@
           <w:rPr>
             <w:rStyle w:val="Hyperlink"/>
           </w:rPr>
-          <w:t>Roman Empire - interactive maps and history from the origins to the fall</w:t>
+          <w:t>Roman Empire - interactive m</w:t>
+        </w:r>
+        <w:r>
+          <w:rPr>
+            <w:rStyle w:val="Hyperlink"/>
+          </w:rPr>
+          <w:t>a</w:t>
+        </w:r>
+        <w:r>
+          <w:rPr>
+            <w:rStyle w:val="Hyperlink"/>
+          </w:rPr>
+          <w:t>ps and history from the origins to the fall</w:t>
         </w:r>
       </w:hyperlink>
     </w:p>
@@ -1247,6 +1317,18 @@
       <w:shd w:val="clear" w:color="auto" w:fill="E1DFDD"/>
     </w:rPr>
   </w:style>
+  <w:style w:type="character" w:styleId="FollowedHyperlink">
+    <w:name w:val="FollowedHyperlink"/>
+    <w:basedOn w:val="DefaultParagraphFont"/>
+    <w:uiPriority w:val="99"/>
+    <w:semiHidden/>
+    <w:unhideWhenUsed/>
+    <w:rsid w:val="003E5629"/>
+    <w:rPr>
+      <w:color w:val="96607D" w:themeColor="followedHyperlink"/>
+      <w:u w:val="single"/>
+    </w:rPr>
+  </w:style>
 </w:styles>
 </file>
 

</xml_diff>

<commit_message>
(update): add k-means clustering to the analysis
</commit_message>
<xml_diff>
--- a/blog_post_draft.docx
+++ b/blog_post_draft.docx
@@ -269,29 +269,36 @@
     </w:p>
     <w:p>
       <w:r>
-        <w:t>Ok, ok, it’s a bunch of bluish dots on a white background – what are we really looking at? Each dot represents a single reported shipwreck for which our dataset provides location information. They’ve been slightly transparent to make clusters of shipwrecks easier to see.</w:t>
-      </w:r>
-    </w:p>
-    <w:p>
+        <w:t xml:space="preserve">The nautical world certainly is filled to the brim with danger, isn’t it? </w:t>
+      </w:r>
+      <w:r>
+        <w:t>Still, some places appear to a bit less hostile than others.</w:t>
+      </w:r>
+    </w:p>
+    <w:p>
+      <w:r>
+        <w:t xml:space="preserve">Zone 0 (red) has a lot of tightly packed shipwrecks following the southern coast of Monaco and surrounding the islands of Sardegna and Corse. Without further information on the </w:t>
+      </w:r>
       <w:r>
         <w:lastRenderedPageBreak/>
-        <w:t>Alright, so there’s quite a few shipwrecks near Italy. This is expected – that’s where most of the traffic is going to be after all. We have an even looking distribution of shipwrecks in the Eastern Mediterranean Sea, and a line of death in the South of France.</w:t>
-      </w:r>
-    </w:p>
-    <w:p>
-      <w:r>
-        <w:t>Something is going on there – maybe our young hero is best off avoiding it!</w:t>
-      </w:r>
-    </w:p>
+        <w:t>frequency of ship travel in these areas, Marcus should consider steering clear (or demanding hazard pay!)</w:t>
+      </w:r>
+    </w:p>
+    <w:p>
+      <w:r>
+        <w:t>Zone 3 (grey) is a coastline of death! Shipwrecks litter the coast of Croatia and Montenegro. Its not clear what the cause is – but Marcus may want to stay away from that coast if he values his life!</w:t>
+      </w:r>
+    </w:p>
+    <w:p>
+      <w:r>
+        <w:t>Zone 1(purple) and Zone 2(brown): Here the shipwrecks are spread out a bit more – there’s no clear “coast of death” in these zones. While they are clearly not entirely without danger – based on the data we have, they seem to offer a safer work environment. Marcus may want to see out ships that work in these zones.</w:t>
+      </w:r>
+    </w:p>
+    <w:p/>
     <w:p>
       <w:pPr>
         <w:pStyle w:val="Heading2"/>
       </w:pPr>
-    </w:p>
-    <w:p>
-      <w:pPr>
-        <w:pStyle w:val="Heading2"/>
-      </w:pPr>
       <w:r>
         <w:t xml:space="preserve">The </w:t>
       </w:r>
@@ -304,12 +311,15 @@
     </w:p>
     <w:p>
       <w:r>
-        <w:t>As he goes out into the world and begins his nautical career, Marcus would be served by looking for the biggest ship he can find. Once on it, he may want to avoid going anywhere in the Western Mediterranean Sea – especially near the South Coast of France.</w:t>
-      </w:r>
-    </w:p>
-    <w:p>
-      <w:r>
-        <w:t>This won’t guarantee his safety of course – but if safety was the only thing that mattered, Marcus would just say home and drink some wine!</w:t>
+        <w:t>Marcus should look for the biggest ship he can find that’s headed for either Southern Italy, or to the</w:t>
+      </w:r>
+      <w:r>
+        <w:t xml:space="preserve"> seas near Greece and Turkey. A big ship in a place with fewer clear navigational hotspots gives him a reasonable shot at safety.</w:t>
+      </w:r>
+    </w:p>
+    <w:p>
+      <w:r>
+        <w:t>Of course, safety isn’t the only thing that matters – and frankly there is no route he can take that is entirely without danger. But what’s adventure without a little danger, eh? After all, if he wanted to be perfectly safe, he could’ve stayed home and enjoyed some nice Italian wine.</w:t>
       </w:r>
     </w:p>
     <w:p>
@@ -351,19 +361,7 @@
           <w:rPr>
             <w:rStyle w:val="Hyperlink"/>
           </w:rPr>
-          <w:t>Roman Empire - interactive m</w:t>
-        </w:r>
-        <w:r>
-          <w:rPr>
-            <w:rStyle w:val="Hyperlink"/>
-          </w:rPr>
-          <w:t>a</w:t>
-        </w:r>
-        <w:r>
-          <w:rPr>
-            <w:rStyle w:val="Hyperlink"/>
-          </w:rPr>
-          <w:t>ps and history from the origins to the fall</w:t>
+          <w:t>Roman Empire - interactive maps and history from the origins to the fall</w:t>
         </w:r>
       </w:hyperlink>
     </w:p>

</xml_diff>